<commit_message>
feat: update job title to Senior Software Engineer in NameCard component
</commit_message>
<xml_diff>
--- a/public/docs/Resume.docx
+++ b/public/docs/Resume.docx
@@ -232,7 +232,13 @@
               <w:pStyle w:val="Subtitle"/>
             </w:pPr>
             <w:r>
-              <w:t>Software Developer</w:t>
+              <w:t xml:space="preserve">SENIOR </w:t>
+            </w:r>
+            <w:r>
+              <w:t xml:space="preserve">Software </w:t>
+            </w:r>
+            <w:r>
+              <w:t>ENGINEER</w:t>
             </w:r>
           </w:p>
         </w:tc>
@@ -452,9 +458,11 @@
             <w:pPr>
               <w:pStyle w:val="Heading2"/>
             </w:pPr>
+            <w:proofErr w:type="spellStart"/>
             <w:r>
               <w:t>contact@jaruwat.dev</w:t>
             </w:r>
+            <w:proofErr w:type="spellEnd"/>
           </w:p>
           <w:p>
             <w:pPr>
@@ -483,19 +491,19 @@
           </w:tcPr>
           <w:p>
             <w:r>
-              <w:t>I have 3 years of working experience as a Software Developer</w:t>
+              <w:t xml:space="preserve">I have </w:t>
+            </w:r>
+            <w:r>
+              <w:t>4</w:t>
+            </w:r>
+            <w:r>
+              <w:t xml:space="preserve"> years of working experience as a Software Developer</w:t>
             </w:r>
             <w:r>
               <w:t>.</w:t>
             </w:r>
             <w:r>
-              <w:t xml:space="preserve"> However, I have been learning and gaining experience in software development for many years prior to this.</w:t>
-            </w:r>
-            <w:r>
-              <w:t xml:space="preserve"> </w:t>
-            </w:r>
-            <w:r>
-              <w:t>I have consistently studied, understood, and developed personal projects throughout my journey. This has provided me with a strong understanding of technology trends over the past 10 years, enabling me to effectively apply my experience in my work.</w:t>
+              <w:t xml:space="preserve"> However, I have been learning and gaining experience in software development for many years prior to this. I have consistently studied, understood, and developed personal projects throughout my journey. This has provided me with a strong understanding of technology trends over the past 10 years, enabling me to effectively apply my experience in my work.</w:t>
             </w:r>
           </w:p>
           <w:p/>
@@ -762,8 +770,13 @@
               <w:pStyle w:val="Heading3"/>
               <w:jc w:val="both"/>
             </w:pPr>
-            <w:r>
-              <w:t xml:space="preserve">Orisma </w:t>
+            <w:proofErr w:type="spellStart"/>
+            <w:r>
+              <w:t>Larngear</w:t>
+            </w:r>
+            <w:proofErr w:type="spellEnd"/>
+            <w:r>
+              <w:t xml:space="preserve"> </w:t>
             </w:r>
             <w:r>
               <w:t>Technology</w:t>
@@ -776,7 +789,10 @@
               <w:t xml:space="preserve">                                                     </w:t>
             </w:r>
             <w:r>
-              <w:t xml:space="preserve">2022 </w:t>
+              <w:t>2025</w:t>
+            </w:r>
+            <w:r>
+              <w:t xml:space="preserve"> </w:t>
             </w:r>
             <w:r>
               <w:t>–</w:t>
@@ -787,7 +803,19 @@
           </w:p>
           <w:p>
             <w:r>
-              <w:t>Develop products for company and their customers.</w:t>
+              <w:t>Develop</w:t>
+            </w:r>
+            <w:r>
+              <w:t>ed</w:t>
+            </w:r>
+            <w:r>
+              <w:t xml:space="preserve"> </w:t>
+            </w:r>
+            <w:r>
+              <w:t>software for the company and its clients while overseeing overall project management</w:t>
+            </w:r>
+            <w:r>
+              <w:t>.</w:t>
             </w:r>
           </w:p>
           <w:p>
@@ -813,7 +841,109 @@
               <w:ind w:left="360"/>
             </w:pPr>
             <w:r>
-              <w:t>Using Flutter, React Native, and Vue Native to develop mobile application.</w:t>
+              <w:t xml:space="preserve">Using </w:t>
+            </w:r>
+            <w:r>
+              <w:t>Next.js</w:t>
+            </w:r>
+            <w:r>
+              <w:t xml:space="preserve">, </w:t>
+            </w:r>
+            <w:r>
+              <w:t>Vite.js,</w:t>
+            </w:r>
+            <w:r>
+              <w:t xml:space="preserve"> </w:t>
+            </w:r>
+            <w:r>
+              <w:t xml:space="preserve">Prisma, </w:t>
+            </w:r>
+            <w:r>
+              <w:t>Knex</w:t>
+            </w:r>
+            <w:r>
+              <w:t xml:space="preserve"> and Ant Design </w:t>
+            </w:r>
+            <w:r>
+              <w:t xml:space="preserve">to develop </w:t>
+            </w:r>
+            <w:r>
+              <w:t>web</w:t>
+            </w:r>
+            <w:r>
+              <w:t xml:space="preserve"> application.</w:t>
+            </w:r>
+          </w:p>
+          <w:p>
+            <w:pPr>
+              <w:pStyle w:val="ListParagraph"/>
+              <w:numPr>
+                <w:ilvl w:val="0"/>
+                <w:numId w:val="6"/>
+              </w:numPr>
+              <w:ind w:left="360" w:hanging="348"/>
+            </w:pPr>
+            <w:r>
+              <w:t>Provided technical mentorship to the team to ensure efficient software development and fulfillment of customer requirements.</w:t>
+            </w:r>
+          </w:p>
+          <w:p/>
+          <w:p>
+            <w:pPr>
+              <w:pStyle w:val="Heading3"/>
+              <w:jc w:val="both"/>
+            </w:pPr>
+            <w:proofErr w:type="spellStart"/>
+            <w:r>
+              <w:t>Orisma</w:t>
+            </w:r>
+            <w:proofErr w:type="spellEnd"/>
+            <w:r>
+              <w:t xml:space="preserve"> Technology</w:t>
+            </w:r>
+            <w:r>
+              <w:rPr>
+                <w:b w:val="0"/>
+                <w:bCs/>
+              </w:rPr>
+              <w:t xml:space="preserve">                                                     </w:t>
+            </w:r>
+            <w:r>
+              <w:rPr>
+                <w:b w:val="0"/>
+                <w:bCs/>
+              </w:rPr>
+              <w:t xml:space="preserve"> </w:t>
+            </w:r>
+            <w:r>
+              <w:t xml:space="preserve">2022 </w:t>
+            </w:r>
+            <w:r>
+              <w:t>–</w:t>
+            </w:r>
+            <w:r>
+              <w:t xml:space="preserve"> </w:t>
+            </w:r>
+            <w:r>
+              <w:t>2025</w:t>
+            </w:r>
+          </w:p>
+          <w:p>
+            <w:r>
+              <w:t>Develop products for company and their customers.</w:t>
+            </w:r>
+          </w:p>
+          <w:p>
+            <w:pPr>
+              <w:pStyle w:val="ListParagraph"/>
+              <w:numPr>
+                <w:ilvl w:val="0"/>
+                <w:numId w:val="6"/>
+              </w:numPr>
+              <w:ind w:left="360" w:hanging="348"/>
+            </w:pPr>
+            <w:r>
+              <w:t>Designing project structures and developing core system.</w:t>
             </w:r>
           </w:p>
           <w:p>
@@ -826,46 +956,7 @@
               <w:ind w:left="360"/>
             </w:pPr>
             <w:r>
-              <w:t>Maintained legacy codebases to ensure continued usability and support future development.</w:t>
-            </w:r>
-          </w:p>
-          <w:p/>
-          <w:p>
-            <w:pPr>
-              <w:pStyle w:val="Heading3"/>
-            </w:pPr>
-            <w:r>
-              <w:t>FPSMember Website</w:t>
-            </w:r>
-            <w:r>
-              <w:rPr>
-                <w:b w:val="0"/>
-                <w:bCs/>
-              </w:rPr>
-              <w:t xml:space="preserve">                                   </w:t>
-            </w:r>
-            <w:r>
-              <w:t>202</w:t>
-            </w:r>
-            <w:r>
-              <w:t>0</w:t>
-            </w:r>
-            <w:r>
-              <w:t xml:space="preserve"> </w:t>
-            </w:r>
-            <w:r>
-              <w:t>–</w:t>
-            </w:r>
-            <w:r>
-              <w:t xml:space="preserve"> </w:t>
-            </w:r>
-            <w:r>
-              <w:t>2022 (Freelance)</w:t>
-            </w:r>
-          </w:p>
-          <w:p>
-            <w:r>
-              <w:t>This project was commissioned by FPSThailand to allow their Twitch members to participate in random prize giveaways from their favorite streamers.</w:t>
+              <w:t>Using Flutter, React Native, and Vue Native to develop mobile application.</w:t>
             </w:r>
           </w:p>
           <w:p>
@@ -875,56 +966,13 @@
                 <w:ilvl w:val="0"/>
                 <w:numId w:val="6"/>
               </w:numPr>
-              <w:ind w:left="360" w:hanging="348"/>
+              <w:ind w:left="360"/>
             </w:pPr>
             <w:r>
-              <w:t>I was involved in the design and development of the frontend and the prize giveaway algorithm.</w:t>
-            </w:r>
-          </w:p>
-          <w:p>
-            <w:pPr>
-              <w:pStyle w:val="ListParagraph"/>
-              <w:numPr>
-                <w:ilvl w:val="0"/>
-                <w:numId w:val="6"/>
-              </w:numPr>
-              <w:ind w:left="360" w:hanging="348"/>
-            </w:pPr>
-            <w:r>
-              <w:t>Written with</w:t>
-            </w:r>
-            <w:r>
-              <w:t xml:space="preserve"> </w:t>
-            </w:r>
-            <w:r>
-              <w:t xml:space="preserve">basic </w:t>
-            </w:r>
-            <w:r>
-              <w:t xml:space="preserve">HTML, CSS and JS </w:t>
-            </w:r>
-            <w:r>
-              <w:t xml:space="preserve">(with </w:t>
-            </w:r>
-            <w:r>
-              <w:t>jQuery</w:t>
-            </w:r>
-            <w:r>
-              <w:t>)</w:t>
-            </w:r>
-          </w:p>
-          <w:p>
-            <w:pPr>
-              <w:pStyle w:val="ListParagraph"/>
-              <w:numPr>
-                <w:ilvl w:val="0"/>
-                <w:numId w:val="6"/>
-              </w:numPr>
-              <w:ind w:left="360" w:hanging="348"/>
-            </w:pPr>
-            <w:r>
-              <w:t>Maintenance while providing service and develop features according to each phase in the time frame.</w:t>
-            </w:r>
-          </w:p>
+              <w:t>Maintained legacy codebases to ensure continued usability and support future development.</w:t>
+            </w:r>
+          </w:p>
+          <w:p/>
           <w:p/>
           <w:p>
             <w:pPr>
@@ -1021,8 +1069,13 @@
             <w:r>
               <w:t xml:space="preserve">React Native, </w:t>
             </w:r>
-            <w:r>
-              <w:t xml:space="preserve">ElysiaJS, </w:t>
+            <w:proofErr w:type="spellStart"/>
+            <w:r>
+              <w:t>ElysiaJS</w:t>
+            </w:r>
+            <w:proofErr w:type="spellEnd"/>
+            <w:r>
+              <w:t xml:space="preserve">, </w:t>
             </w:r>
             <w:r>
               <w:t>Next.js</w:t>
@@ -1057,7 +1110,7 @@
               <w:t xml:space="preserve">: </w:t>
             </w:r>
             <w:r>
-              <w:t>React.js</w:t>
+              <w:t>React</w:t>
             </w:r>
             <w:r>
               <w:t xml:space="preserve">, </w:t>
@@ -1078,7 +1131,22 @@
               <w:t xml:space="preserve">Other: </w:t>
             </w:r>
             <w:r>
-              <w:t>Drizzle ORM, G</w:t>
+              <w:t>Prisma, D</w:t>
+            </w:r>
+            <w:r>
+              <w:t>rizzl</w:t>
+            </w:r>
+            <w:r>
+              <w:t>e</w:t>
+            </w:r>
+            <w:r>
+              <w:t>,</w:t>
+            </w:r>
+            <w:r>
+              <w:t xml:space="preserve"> Knex,</w:t>
+            </w:r>
+            <w:r>
+              <w:t xml:space="preserve"> G</w:t>
             </w:r>
             <w:r>
               <w:t xml:space="preserve">it, </w:t>
@@ -1104,11 +1172,6 @@
           </w:p>
           <w:p/>
           <w:p/>
-          <w:p>
-            <w:pPr>
-              <w:pStyle w:val="Heading3"/>
-            </w:pPr>
-          </w:p>
           <w:p/>
         </w:tc>
         <w:tc>
@@ -1276,8 +1339,13 @@
                 </wp:anchor>
               </w:drawing>
             </w:r>
-            <w:r>
-              <w:t>jaruwat.dev/portfolio</w:t>
+            <w:proofErr w:type="spellStart"/>
+            <w:r>
+              <w:t>jaruwat.dev</w:t>
+            </w:r>
+            <w:proofErr w:type="spellEnd"/>
+            <w:r>
+              <w:t>/portfolio</w:t>
             </w:r>
           </w:p>
         </w:tc>
@@ -2660,6 +2728,7 @@
   <w:style w:type="character" w:default="1" w:styleId="DefaultParagraphFont">
     <w:name w:val="Default Paragraph Font"/>
     <w:uiPriority w:val="1"/>
+    <w:semiHidden/>
     <w:unhideWhenUsed/>
   </w:style>
   <w:style w:type="table" w:default="1" w:styleId="TableNormal">
@@ -3170,7 +3239,7 @@
   <w:font w:name="Symbol">
     <w:panose1 w:val="05050102010706020507"/>
     <w:charset w:val="02"/>
-    <w:family w:val="roman"/>
+    <w:family w:val="decorative"/>
     <w:pitch w:val="variable"/>
     <w:sig w:usb0="00000000" w:usb1="10000000" w:usb2="00000000" w:usb3="00000000" w:csb0="80000000" w:csb1="00000000"/>
   </w:font>
@@ -3190,10 +3259,10 @@
   </w:font>
   <w:font w:name="Wingdings">
     <w:panose1 w:val="05000000000000000000"/>
-    <w:charset w:val="02"/>
-    <w:family w:val="auto"/>
+    <w:charset w:val="4D"/>
+    <w:family w:val="decorative"/>
     <w:pitch w:val="variable"/>
-    <w:sig w:usb0="00000000" w:usb1="10000000" w:usb2="00000000" w:usb3="00000000" w:csb0="80000000" w:csb1="00000000"/>
+    <w:sig w:usb0="00000003" w:usb1="00000000" w:usb2="00000000" w:usb3="00000000" w:csb0="80000001" w:csb1="00000000"/>
   </w:font>
   <w:font w:name="Segoe UI">
     <w:panose1 w:val="020B0502040204020203"/>
@@ -3218,7 +3287,7 @@
   </w:font>
   <w:font w:name="Times New Roman (Headings CS)">
     <w:altName w:val="Times New Roman"/>
-    <w:panose1 w:val="00000000000000000000"/>
+    <w:panose1 w:val="020B0604020202020204"/>
     <w:charset w:val="00"/>
     <w:family w:val="roman"/>
     <w:notTrueType/>
@@ -3226,32 +3295,32 @@
   </w:font>
   <w:font w:name="Angsana New">
     <w:panose1 w:val="02020603050405020304"/>
-    <w:charset w:val="00"/>
+    <w:charset w:val="DE"/>
     <w:family w:val="roman"/>
     <w:pitch w:val="variable"/>
     <w:sig w:usb0="81000003" w:usb1="00000000" w:usb2="00000000" w:usb3="00000000" w:csb0="00010001" w:csb1="00000000"/>
   </w:font>
   <w:font w:name="Times New Roman (Body CS)">
     <w:altName w:val="Times New Roman"/>
-    <w:panose1 w:val="00000000000000000000"/>
+    <w:panose1 w:val="020B0604020202020204"/>
     <w:charset w:val="00"/>
     <w:family w:val="roman"/>
     <w:notTrueType/>
     <w:pitch w:val="default"/>
   </w:font>
-  <w:font w:name="Calibri">
-    <w:panose1 w:val="020F0502020204030204"/>
+  <w:font w:name="Aptos">
+    <w:panose1 w:val="020B0004020202020204"/>
     <w:charset w:val="00"/>
     <w:family w:val="swiss"/>
     <w:pitch w:val="variable"/>
-    <w:sig w:usb0="E4002EFF" w:usb1="C200247B" w:usb2="00000009" w:usb3="00000000" w:csb0="000001FF" w:csb1="00000000"/>
+    <w:sig w:usb0="20000287" w:usb1="00000003" w:usb2="00000000" w:usb3="00000000" w:csb0="0000019F" w:csb1="00000000"/>
   </w:font>
-  <w:font w:name="Calibri Light">
-    <w:panose1 w:val="020F0302020204030204"/>
+  <w:font w:name="Aptos Display">
+    <w:panose1 w:val="020B0004020202020204"/>
     <w:charset w:val="00"/>
     <w:family w:val="swiss"/>
     <w:pitch w:val="variable"/>
-    <w:sig w:usb0="E4002EFF" w:usb1="C200247B" w:usb2="00000009" w:usb3="00000000" w:csb0="000001FF" w:csb1="00000000"/>
+    <w:sig w:usb0="20000287" w:usb1="00000003" w:usb2="00000000" w:usb3="00000000" w:csb0="0000019F" w:csb1="00000000"/>
   </w:font>
 </w:fonts>
 </file>
@@ -3273,7 +3342,9 @@
   </w:compat>
   <w:rsids>
     <w:rsidRoot w:val="00C70348"/>
+    <w:rsid w:val="001B1890"/>
     <w:rsid w:val="002E27A7"/>
+    <w:rsid w:val="00526A27"/>
     <w:rsid w:val="00606C95"/>
     <w:rsid w:val="00B40335"/>
     <w:rsid w:val="00C70348"/>
@@ -4098,6 +4169,35 @@
 </file>
 
 <file path=customXml/item2.xml><?xml version="1.0" encoding="utf-8"?>
+<p:properties xmlns:p="http://schemas.microsoft.com/office/2006/metadata/properties" xmlns:xsi="http://www.w3.org/2001/XMLSchema-instance" xmlns:pc="http://schemas.microsoft.com/office/infopath/2007/PartnerControls">
+  <documentManagement>
+    <_ip_UnifiedCompliancePolicyUIAction xmlns="http://schemas.microsoft.com/sharepoint/v3" xsi:nil="true"/>
+    <Image xmlns="71af3243-3dd4-4a8d-8c0d-dd76da1f02a5">
+      <Url xsi:nil="true"/>
+      <Description xsi:nil="true"/>
+    </Image>
+    <Status xmlns="71af3243-3dd4-4a8d-8c0d-dd76da1f02a5">Not started</Status>
+    <Background xmlns="71af3243-3dd4-4a8d-8c0d-dd76da1f02a5">false</Background>
+    <_ip_UnifiedCompliancePolicyProperties xmlns="http://schemas.microsoft.com/sharepoint/v3" xsi:nil="true"/>
+    <ImageTagsTaxHTField xmlns="71af3243-3dd4-4a8d-8c0d-dd76da1f02a5">
+      <Terms xmlns="http://schemas.microsoft.com/office/infopath/2007/PartnerControls"/>
+    </ImageTagsTaxHTField>
+    <TaxCatchAll xmlns="230e9df3-be65-4c73-a93b-d1236ebd677e" xsi:nil="true"/>
+    <MediaServiceKeyPoints xmlns="71af3243-3dd4-4a8d-8c0d-dd76da1f02a5" xsi:nil="true"/>
+  </documentManagement>
+</p:properties>
+</file>
+
+<file path=customXml/item3.xml><?xml version="1.0" encoding="utf-8"?>
+<?mso-contentType ?>
+<FormTemplates xmlns="http://schemas.microsoft.com/sharepoint/v3/contenttype/forms">
+  <Display>DocumentLibraryForm</Display>
+  <Edit>DocumentLibraryForm</Edit>
+  <New>DocumentLibraryForm</New>
+</FormTemplates>
+</file>
+
+<file path=customXml/item4.xml><?xml version="1.0" encoding="utf-8"?>
 <ct:contentTypeSchema xmlns:ct="http://schemas.microsoft.com/office/2006/metadata/contentType" xmlns:ma="http://schemas.microsoft.com/office/2006/metadata/properties/metaAttributes" ct:_="" ma:_="" ma:contentTypeName="Document" ma:contentTypeID="0x01010079F111ED35F8CC479449609E8A0923A6" ma:contentTypeVersion="28" ma:contentTypeDescription="Create a new document." ma:contentTypeScope="" ma:versionID="60f5a4f2d2b0abadcf532d48ebf9cb71">
   <xsd:schema xmlns:xsd="http://www.w3.org/2001/XMLSchema" xmlns:xs="http://www.w3.org/2001/XMLSchema" xmlns:p="http://schemas.microsoft.com/office/2006/metadata/properties" xmlns:ns1="http://schemas.microsoft.com/sharepoint/v3" xmlns:ns2="71af3243-3dd4-4a8d-8c0d-dd76da1f02a5" xmlns:ns3="16c05727-aa75-4e4a-9b5f-8a80a1165891" xmlns:ns4="230e9df3-be65-4c73-a93b-d1236ebd677e" targetNamespace="http://schemas.microsoft.com/office/2006/metadata/properties" ma:root="true" ma:fieldsID="7dd78129e6a1811f84807ad11c651531" ns1:_="" ns2:_="" ns3:_="" ns4:_="">
     <xsd:import namespace="http://schemas.microsoft.com/sharepoint/v3"/>
@@ -4409,35 +4509,6 @@
 </ct:contentTypeSchema>
 </file>
 
-<file path=customXml/item3.xml><?xml version="1.0" encoding="utf-8"?>
-<?mso-contentType ?>
-<FormTemplates xmlns="http://schemas.microsoft.com/sharepoint/v3/contenttype/forms">
-  <Display>DocumentLibraryForm</Display>
-  <Edit>DocumentLibraryForm</Edit>
-  <New>DocumentLibraryForm</New>
-</FormTemplates>
-</file>
-
-<file path=customXml/item4.xml><?xml version="1.0" encoding="utf-8"?>
-<p:properties xmlns:p="http://schemas.microsoft.com/office/2006/metadata/properties" xmlns:xsi="http://www.w3.org/2001/XMLSchema-instance" xmlns:pc="http://schemas.microsoft.com/office/infopath/2007/PartnerControls">
-  <documentManagement>
-    <_ip_UnifiedCompliancePolicyUIAction xmlns="http://schemas.microsoft.com/sharepoint/v3" xsi:nil="true"/>
-    <Image xmlns="71af3243-3dd4-4a8d-8c0d-dd76da1f02a5">
-      <Url xsi:nil="true"/>
-      <Description xsi:nil="true"/>
-    </Image>
-    <Status xmlns="71af3243-3dd4-4a8d-8c0d-dd76da1f02a5">Not started</Status>
-    <Background xmlns="71af3243-3dd4-4a8d-8c0d-dd76da1f02a5">false</Background>
-    <_ip_UnifiedCompliancePolicyProperties xmlns="http://schemas.microsoft.com/sharepoint/v3" xsi:nil="true"/>
-    <ImageTagsTaxHTField xmlns="71af3243-3dd4-4a8d-8c0d-dd76da1f02a5">
-      <Terms xmlns="http://schemas.microsoft.com/office/infopath/2007/PartnerControls"/>
-    </ImageTagsTaxHTField>
-    <TaxCatchAll xmlns="230e9df3-be65-4c73-a93b-d1236ebd677e" xsi:nil="true"/>
-    <MediaServiceKeyPoints xmlns="71af3243-3dd4-4a8d-8c0d-dd76da1f02a5" xsi:nil="true"/>
-  </documentManagement>
-</p:properties>
-</file>
-
 <file path=customXml/itemProps1.xml><?xml version="1.0" encoding="utf-8"?>
 <ds:datastoreItem xmlns:ds="http://schemas.openxmlformats.org/officeDocument/2006/customXml" ds:itemID="{81F788BB-310B-43D7-B9F5-95A6C7D991AA}">
   <ds:schemaRefs>
@@ -4447,6 +4518,26 @@
 </file>
 
 <file path=customXml/itemProps2.xml><?xml version="1.0" encoding="utf-8"?>
+<ds:datastoreItem xmlns:ds="http://schemas.openxmlformats.org/officeDocument/2006/customXml" ds:itemID="{4720275F-CC8A-4230-8267-B84213CEBBD9}">
+  <ds:schemaRefs>
+    <ds:schemaRef ds:uri="http://schemas.microsoft.com/office/2006/metadata/properties"/>
+    <ds:schemaRef ds:uri="http://schemas.microsoft.com/office/infopath/2007/PartnerControls"/>
+    <ds:schemaRef ds:uri="http://schemas.microsoft.com/sharepoint/v3"/>
+    <ds:schemaRef ds:uri="71af3243-3dd4-4a8d-8c0d-dd76da1f02a5"/>
+    <ds:schemaRef ds:uri="230e9df3-be65-4c73-a93b-d1236ebd677e"/>
+  </ds:schemaRefs>
+</ds:datastoreItem>
+</file>
+
+<file path=customXml/itemProps3.xml><?xml version="1.0" encoding="utf-8"?>
+<ds:datastoreItem xmlns:ds="http://schemas.openxmlformats.org/officeDocument/2006/customXml" ds:itemID="{2D5CED70-FA13-46C4-A102-29F5645502CE}">
+  <ds:schemaRefs>
+    <ds:schemaRef ds:uri="http://schemas.microsoft.com/sharepoint/v3/contenttype/forms"/>
+  </ds:schemaRefs>
+</ds:datastoreItem>
+</file>
+
+<file path=customXml/itemProps4.xml><?xml version="1.0" encoding="utf-8"?>
 <ds:datastoreItem xmlns:ds="http://schemas.openxmlformats.org/officeDocument/2006/customXml" ds:itemID="{DC41AEFC-F52C-404E-B283-E9E6F4470B13}">
   <ds:schemaRefs>
     <ds:schemaRef ds:uri="http://schemas.microsoft.com/office/2006/metadata/contentType"/>
@@ -4467,26 +4558,6 @@
 </ds:datastoreItem>
 </file>
 
-<file path=customXml/itemProps3.xml><?xml version="1.0" encoding="utf-8"?>
-<ds:datastoreItem xmlns:ds="http://schemas.openxmlformats.org/officeDocument/2006/customXml" ds:itemID="{2D5CED70-FA13-46C4-A102-29F5645502CE}">
-  <ds:schemaRefs>
-    <ds:schemaRef ds:uri="http://schemas.microsoft.com/sharepoint/v3/contenttype/forms"/>
-  </ds:schemaRefs>
-</ds:datastoreItem>
-</file>
-
-<file path=customXml/itemProps4.xml><?xml version="1.0" encoding="utf-8"?>
-<ds:datastoreItem xmlns:ds="http://schemas.openxmlformats.org/officeDocument/2006/customXml" ds:itemID="{4720275F-CC8A-4230-8267-B84213CEBBD9}">
-  <ds:schemaRefs>
-    <ds:schemaRef ds:uri="http://schemas.microsoft.com/office/2006/metadata/properties"/>
-    <ds:schemaRef ds:uri="http://schemas.microsoft.com/office/infopath/2007/PartnerControls"/>
-    <ds:schemaRef ds:uri="http://schemas.microsoft.com/sharepoint/v3"/>
-    <ds:schemaRef ds:uri="71af3243-3dd4-4a8d-8c0d-dd76da1f02a5"/>
-    <ds:schemaRef ds:uri="230e9df3-be65-4c73-a93b-d1236ebd677e"/>
-  </ds:schemaRefs>
-</ds:datastoreItem>
-</file>
-
 <file path=docMetadata/LabelInfo.xml><?xml version="1.0" encoding="utf-8"?>
 <clbl:labelList xmlns:clbl="http://schemas.microsoft.com/office/2020/mipLabelMetadata"/>
 </file>
</xml_diff>

<commit_message>
feat: update Resume document with latest information
</commit_message>
<xml_diff>
--- a/public/docs/Resume.docx
+++ b/public/docs/Resume.docx
@@ -998,10 +998,16 @@
             </w:pPr>
           </w:p>
           <w:p>
+            <w:pPr>
+              <w:rPr>
+                <w:u w:val="words"/>
+              </w:rPr>
+            </w:pPr>
             <w:r>
               <w:rPr>
                 <w:b/>
                 <w:bCs/>
+                <w:u w:val="words"/>
               </w:rPr>
               <w:t xml:space="preserve">Programing </w:t>
             </w:r>
@@ -1009,89 +1015,148 @@
               <w:rPr>
                 <w:b/>
                 <w:bCs/>
+                <w:u w:val="words"/>
               </w:rPr>
               <w:t xml:space="preserve">Language: </w:t>
             </w:r>
             <w:r>
+              <w:rPr>
+                <w:u w:val="words"/>
+              </w:rPr>
               <w:t>TS</w:t>
             </w:r>
             <w:r>
+              <w:rPr>
+                <w:u w:val="words"/>
+              </w:rPr>
               <w:t xml:space="preserve">, </w:t>
             </w:r>
             <w:r>
+              <w:rPr>
+                <w:u w:val="words"/>
+              </w:rPr>
               <w:t>JS</w:t>
             </w:r>
             <w:r>
+              <w:rPr>
+                <w:u w:val="words"/>
+              </w:rPr>
               <w:t xml:space="preserve">, </w:t>
             </w:r>
             <w:r>
-              <w:t>Dart</w:t>
-            </w:r>
-            <w:r>
-              <w:t>,</w:t>
-            </w:r>
-            <w:r>
-              <w:t xml:space="preserve"> </w:t>
-            </w:r>
-            <w:r>
+              <w:rPr>
+                <w:u w:val="words"/>
+              </w:rPr>
+              <w:t xml:space="preserve">Dart, </w:t>
+            </w:r>
+            <w:r>
+              <w:rPr>
+                <w:u w:val="words"/>
+              </w:rPr>
               <w:t xml:space="preserve">C#, </w:t>
             </w:r>
             <w:r>
+              <w:rPr>
+                <w:u w:val="words"/>
+              </w:rPr>
               <w:t xml:space="preserve">Python, </w:t>
             </w:r>
             <w:r>
+              <w:rPr>
+                <w:u w:val="words"/>
+              </w:rPr>
               <w:t>PHP, Lua, SQL</w:t>
             </w:r>
             <w:r>
+              <w:rPr>
+                <w:u w:val="words"/>
+              </w:rPr>
               <w:t xml:space="preserve">, </w:t>
             </w:r>
             <w:r>
+              <w:rPr>
+                <w:u w:val="words"/>
+              </w:rPr>
               <w:t>Golang</w:t>
             </w:r>
             <w:r>
+              <w:rPr>
+                <w:u w:val="words"/>
+              </w:rPr>
               <w:t xml:space="preserve">, </w:t>
             </w:r>
           </w:p>
           <w:p>
             <w:pPr>
               <w:ind w:left="708" w:hanging="708"/>
+              <w:rPr>
+                <w:u w:val="words"/>
+              </w:rPr>
             </w:pPr>
             <w:r>
               <w:rPr>
                 <w:b/>
                 <w:bCs/>
+                <w:u w:val="words"/>
               </w:rPr>
               <w:t xml:space="preserve">Framework: </w:t>
             </w:r>
             <w:r>
+              <w:rPr>
+                <w:u w:val="words"/>
+              </w:rPr>
               <w:t xml:space="preserve">Flutter, </w:t>
             </w:r>
             <w:r>
+              <w:rPr>
+                <w:u w:val="words"/>
+              </w:rPr>
               <w:t xml:space="preserve">React Native, </w:t>
             </w:r>
             <w:proofErr w:type="spellStart"/>
             <w:r>
+              <w:rPr>
+                <w:u w:val="words"/>
+              </w:rPr>
               <w:t>ElysiaJS</w:t>
             </w:r>
             <w:proofErr w:type="spellEnd"/>
             <w:r>
+              <w:rPr>
+                <w:u w:val="words"/>
+              </w:rPr>
               <w:t xml:space="preserve">, </w:t>
             </w:r>
             <w:r>
+              <w:rPr>
+                <w:u w:val="words"/>
+              </w:rPr>
               <w:t>Next.js</w:t>
             </w:r>
             <w:r>
+              <w:rPr>
+                <w:u w:val="words"/>
+              </w:rPr>
               <w:t xml:space="preserve">, </w:t>
             </w:r>
             <w:r>
+              <w:rPr>
+                <w:u w:val="words"/>
+              </w:rPr>
               <w:t>Electron</w:t>
             </w:r>
           </w:p>
           <w:p>
+            <w:pPr>
+              <w:rPr>
+                <w:u w:val="words"/>
+              </w:rPr>
+            </w:pPr>
             <w:r>
               <w:rPr>
                 <w:b/>
                 <w:bCs/>
+                <w:u w:val="words"/>
               </w:rPr>
               <w:t>Librar</w:t>
             </w:r>
@@ -1099,6 +1164,7 @@
               <w:rPr>
                 <w:b/>
                 <w:bCs/>
+                <w:u w:val="words"/>
               </w:rPr>
               <w:t>ies</w:t>
             </w:r>
@@ -1106,67 +1172,125 @@
               <w:rPr>
                 <w:b/>
                 <w:bCs/>
+                <w:u w:val="words"/>
               </w:rPr>
               <w:t xml:space="preserve">: </w:t>
             </w:r>
             <w:r>
+              <w:rPr>
+                <w:u w:val="words"/>
+              </w:rPr>
               <w:t>React</w:t>
             </w:r>
             <w:r>
+              <w:rPr>
+                <w:u w:val="words"/>
+              </w:rPr>
               <w:t xml:space="preserve">, </w:t>
             </w:r>
             <w:r>
+              <w:rPr>
+                <w:u w:val="words"/>
+              </w:rPr>
               <w:t xml:space="preserve">Drift, </w:t>
             </w:r>
             <w:r>
+              <w:rPr>
+                <w:u w:val="words"/>
+              </w:rPr>
               <w:t>Framer Motion</w:t>
             </w:r>
           </w:p>
           <w:p>
+            <w:pPr>
+              <w:rPr>
+                <w:u w:val="words"/>
+              </w:rPr>
+            </w:pPr>
             <w:r>
               <w:rPr>
                 <w:b/>
                 <w:bCs/>
+                <w:u w:val="words"/>
               </w:rPr>
               <w:t xml:space="preserve">Other: </w:t>
             </w:r>
             <w:r>
+              <w:rPr>
+                <w:u w:val="words"/>
+              </w:rPr>
               <w:t>Prisma, D</w:t>
             </w:r>
             <w:r>
+              <w:rPr>
+                <w:u w:val="words"/>
+              </w:rPr>
               <w:t>rizzl</w:t>
             </w:r>
             <w:r>
+              <w:rPr>
+                <w:u w:val="words"/>
+              </w:rPr>
               <w:t>e</w:t>
             </w:r>
             <w:r>
+              <w:rPr>
+                <w:u w:val="words"/>
+              </w:rPr>
               <w:t>,</w:t>
             </w:r>
             <w:r>
+              <w:rPr>
+                <w:u w:val="words"/>
+              </w:rPr>
               <w:t xml:space="preserve"> Knex,</w:t>
             </w:r>
             <w:r>
+              <w:rPr>
+                <w:u w:val="words"/>
+              </w:rPr>
               <w:t xml:space="preserve"> G</w:t>
             </w:r>
             <w:r>
+              <w:rPr>
+                <w:u w:val="words"/>
+              </w:rPr>
               <w:t xml:space="preserve">it, </w:t>
             </w:r>
             <w:r>
+              <w:rPr>
+                <w:u w:val="words"/>
+              </w:rPr>
               <w:t>Docker</w:t>
             </w:r>
             <w:r>
+              <w:rPr>
+                <w:u w:val="words"/>
+              </w:rPr>
               <w:t xml:space="preserve">, </w:t>
             </w:r>
             <w:r>
+              <w:rPr>
+                <w:u w:val="words"/>
+              </w:rPr>
               <w:t>M</w:t>
             </w:r>
             <w:r>
+              <w:rPr>
+                <w:u w:val="words"/>
+              </w:rPr>
               <w:t>ongo</w:t>
             </w:r>
             <w:r>
+              <w:rPr>
+                <w:u w:val="words"/>
+              </w:rPr>
               <w:t>DB</w:t>
             </w:r>
             <w:r>
+              <w:rPr>
+                <w:u w:val="words"/>
+              </w:rPr>
               <w:t>, SCSS, LESS</w:t>
             </w:r>
           </w:p>
@@ -3350,6 +3474,7 @@
     <w:rsid w:val="00C70348"/>
     <w:rsid w:val="00D535DB"/>
     <w:rsid w:val="00EB6124"/>
+    <w:rsid w:val="00F02538"/>
   </w:rsids>
   <m:mathPr>
     <m:mathFont m:val="Cambria Math"/>
@@ -4165,39 +4290,6 @@
 </file>
 
 <file path=customXml/item1.xml><?xml version="1.0" encoding="utf-8"?>
-<b:Sources xmlns:b="http://schemas.openxmlformats.org/officeDocument/2006/bibliography" xmlns="http://schemas.openxmlformats.org/officeDocument/2006/bibliography" SelectedStyle="\APASixthEditionOfficeOnline.xsl" StyleName="APA" Version="6"/>
-</file>
-
-<file path=customXml/item2.xml><?xml version="1.0" encoding="utf-8"?>
-<p:properties xmlns:p="http://schemas.microsoft.com/office/2006/metadata/properties" xmlns:xsi="http://www.w3.org/2001/XMLSchema-instance" xmlns:pc="http://schemas.microsoft.com/office/infopath/2007/PartnerControls">
-  <documentManagement>
-    <_ip_UnifiedCompliancePolicyUIAction xmlns="http://schemas.microsoft.com/sharepoint/v3" xsi:nil="true"/>
-    <Image xmlns="71af3243-3dd4-4a8d-8c0d-dd76da1f02a5">
-      <Url xsi:nil="true"/>
-      <Description xsi:nil="true"/>
-    </Image>
-    <Status xmlns="71af3243-3dd4-4a8d-8c0d-dd76da1f02a5">Not started</Status>
-    <Background xmlns="71af3243-3dd4-4a8d-8c0d-dd76da1f02a5">false</Background>
-    <_ip_UnifiedCompliancePolicyProperties xmlns="http://schemas.microsoft.com/sharepoint/v3" xsi:nil="true"/>
-    <ImageTagsTaxHTField xmlns="71af3243-3dd4-4a8d-8c0d-dd76da1f02a5">
-      <Terms xmlns="http://schemas.microsoft.com/office/infopath/2007/PartnerControls"/>
-    </ImageTagsTaxHTField>
-    <TaxCatchAll xmlns="230e9df3-be65-4c73-a93b-d1236ebd677e" xsi:nil="true"/>
-    <MediaServiceKeyPoints xmlns="71af3243-3dd4-4a8d-8c0d-dd76da1f02a5" xsi:nil="true"/>
-  </documentManagement>
-</p:properties>
-</file>
-
-<file path=customXml/item3.xml><?xml version="1.0" encoding="utf-8"?>
-<?mso-contentType ?>
-<FormTemplates xmlns="http://schemas.microsoft.com/sharepoint/v3/contenttype/forms">
-  <Display>DocumentLibraryForm</Display>
-  <Edit>DocumentLibraryForm</Edit>
-  <New>DocumentLibraryForm</New>
-</FormTemplates>
-</file>
-
-<file path=customXml/item4.xml><?xml version="1.0" encoding="utf-8"?>
 <ct:contentTypeSchema xmlns:ct="http://schemas.microsoft.com/office/2006/metadata/contentType" xmlns:ma="http://schemas.microsoft.com/office/2006/metadata/properties/metaAttributes" ct:_="" ma:_="" ma:contentTypeName="Document" ma:contentTypeID="0x01010079F111ED35F8CC479449609E8A0923A6" ma:contentTypeVersion="28" ma:contentTypeDescription="Create a new document." ma:contentTypeScope="" ma:versionID="60f5a4f2d2b0abadcf532d48ebf9cb71">
   <xsd:schema xmlns:xsd="http://www.w3.org/2001/XMLSchema" xmlns:xs="http://www.w3.org/2001/XMLSchema" xmlns:p="http://schemas.microsoft.com/office/2006/metadata/properties" xmlns:ns1="http://schemas.microsoft.com/sharepoint/v3" xmlns:ns2="71af3243-3dd4-4a8d-8c0d-dd76da1f02a5" xmlns:ns3="16c05727-aa75-4e4a-9b5f-8a80a1165891" xmlns:ns4="230e9df3-be65-4c73-a93b-d1236ebd677e" targetNamespace="http://schemas.microsoft.com/office/2006/metadata/properties" ma:root="true" ma:fieldsID="7dd78129e6a1811f84807ad11c651531" ns1:_="" ns2:_="" ns3:_="" ns4:_="">
     <xsd:import namespace="http://schemas.microsoft.com/sharepoint/v3"/>
@@ -4509,35 +4601,40 @@
 </ct:contentTypeSchema>
 </file>
 
-<file path=customXml/itemProps1.xml><?xml version="1.0" encoding="utf-8"?>
-<ds:datastoreItem xmlns:ds="http://schemas.openxmlformats.org/officeDocument/2006/customXml" ds:itemID="{81F788BB-310B-43D7-B9F5-95A6C7D991AA}">
-  <ds:schemaRefs>
-    <ds:schemaRef ds:uri="http://schemas.openxmlformats.org/officeDocument/2006/bibliography"/>
-  </ds:schemaRefs>
-</ds:datastoreItem>
+<file path=customXml/item2.xml><?xml version="1.0" encoding="utf-8"?>
+<?mso-contentType ?>
+<FormTemplates xmlns="http://schemas.microsoft.com/sharepoint/v3/contenttype/forms">
+  <Display>DocumentLibraryForm</Display>
+  <Edit>DocumentLibraryForm</Edit>
+  <New>DocumentLibraryForm</New>
+</FormTemplates>
 </file>
 
-<file path=customXml/itemProps2.xml><?xml version="1.0" encoding="utf-8"?>
-<ds:datastoreItem xmlns:ds="http://schemas.openxmlformats.org/officeDocument/2006/customXml" ds:itemID="{4720275F-CC8A-4230-8267-B84213CEBBD9}">
-  <ds:schemaRefs>
-    <ds:schemaRef ds:uri="http://schemas.microsoft.com/office/2006/metadata/properties"/>
-    <ds:schemaRef ds:uri="http://schemas.microsoft.com/office/infopath/2007/PartnerControls"/>
-    <ds:schemaRef ds:uri="http://schemas.microsoft.com/sharepoint/v3"/>
-    <ds:schemaRef ds:uri="71af3243-3dd4-4a8d-8c0d-dd76da1f02a5"/>
-    <ds:schemaRef ds:uri="230e9df3-be65-4c73-a93b-d1236ebd677e"/>
-  </ds:schemaRefs>
-</ds:datastoreItem>
+<file path=customXml/item3.xml><?xml version="1.0" encoding="utf-8"?>
+<p:properties xmlns:p="http://schemas.microsoft.com/office/2006/metadata/properties" xmlns:xsi="http://www.w3.org/2001/XMLSchema-instance" xmlns:pc="http://schemas.microsoft.com/office/infopath/2007/PartnerControls">
+  <documentManagement>
+    <_ip_UnifiedCompliancePolicyUIAction xmlns="http://schemas.microsoft.com/sharepoint/v3" xsi:nil="true"/>
+    <Image xmlns="71af3243-3dd4-4a8d-8c0d-dd76da1f02a5">
+      <Url xsi:nil="true"/>
+      <Description xsi:nil="true"/>
+    </Image>
+    <Status xmlns="71af3243-3dd4-4a8d-8c0d-dd76da1f02a5">Not started</Status>
+    <Background xmlns="71af3243-3dd4-4a8d-8c0d-dd76da1f02a5">false</Background>
+    <_ip_UnifiedCompliancePolicyProperties xmlns="http://schemas.microsoft.com/sharepoint/v3" xsi:nil="true"/>
+    <ImageTagsTaxHTField xmlns="71af3243-3dd4-4a8d-8c0d-dd76da1f02a5">
+      <Terms xmlns="http://schemas.microsoft.com/office/infopath/2007/PartnerControls"/>
+    </ImageTagsTaxHTField>
+    <TaxCatchAll xmlns="230e9df3-be65-4c73-a93b-d1236ebd677e" xsi:nil="true"/>
+    <MediaServiceKeyPoints xmlns="71af3243-3dd4-4a8d-8c0d-dd76da1f02a5" xsi:nil="true"/>
+  </documentManagement>
+</p:properties>
 </file>
 
-<file path=customXml/itemProps3.xml><?xml version="1.0" encoding="utf-8"?>
-<ds:datastoreItem xmlns:ds="http://schemas.openxmlformats.org/officeDocument/2006/customXml" ds:itemID="{2D5CED70-FA13-46C4-A102-29F5645502CE}">
-  <ds:schemaRefs>
-    <ds:schemaRef ds:uri="http://schemas.microsoft.com/sharepoint/v3/contenttype/forms"/>
-  </ds:schemaRefs>
-</ds:datastoreItem>
+<file path=customXml/item4.xml><?xml version="1.0" encoding="utf-8"?>
+<b:Sources xmlns:b="http://schemas.openxmlformats.org/officeDocument/2006/bibliography" xmlns="http://schemas.openxmlformats.org/officeDocument/2006/bibliography" SelectedStyle="\APASixthEditionOfficeOnline.xsl" StyleName="APA" Version="6"/>
 </file>
 
-<file path=customXml/itemProps4.xml><?xml version="1.0" encoding="utf-8"?>
+<file path=customXml/itemProps1.xml><?xml version="1.0" encoding="utf-8"?>
 <ds:datastoreItem xmlns:ds="http://schemas.openxmlformats.org/officeDocument/2006/customXml" ds:itemID="{DC41AEFC-F52C-404E-B283-E9E6F4470B13}">
   <ds:schemaRefs>
     <ds:schemaRef ds:uri="http://schemas.microsoft.com/office/2006/metadata/contentType"/>
@@ -4558,6 +4655,34 @@
 </ds:datastoreItem>
 </file>
 
+<file path=customXml/itemProps2.xml><?xml version="1.0" encoding="utf-8"?>
+<ds:datastoreItem xmlns:ds="http://schemas.openxmlformats.org/officeDocument/2006/customXml" ds:itemID="{2D5CED70-FA13-46C4-A102-29F5645502CE}">
+  <ds:schemaRefs>
+    <ds:schemaRef ds:uri="http://schemas.microsoft.com/sharepoint/v3/contenttype/forms"/>
+  </ds:schemaRefs>
+</ds:datastoreItem>
+</file>
+
+<file path=customXml/itemProps3.xml><?xml version="1.0" encoding="utf-8"?>
+<ds:datastoreItem xmlns:ds="http://schemas.openxmlformats.org/officeDocument/2006/customXml" ds:itemID="{4720275F-CC8A-4230-8267-B84213CEBBD9}">
+  <ds:schemaRefs>
+    <ds:schemaRef ds:uri="http://schemas.microsoft.com/office/2006/metadata/properties"/>
+    <ds:schemaRef ds:uri="http://schemas.microsoft.com/office/infopath/2007/PartnerControls"/>
+    <ds:schemaRef ds:uri="http://schemas.microsoft.com/sharepoint/v3"/>
+    <ds:schemaRef ds:uri="71af3243-3dd4-4a8d-8c0d-dd76da1f02a5"/>
+    <ds:schemaRef ds:uri="230e9df3-be65-4c73-a93b-d1236ebd677e"/>
+  </ds:schemaRefs>
+</ds:datastoreItem>
+</file>
+
+<file path=customXml/itemProps4.xml><?xml version="1.0" encoding="utf-8"?>
+<ds:datastoreItem xmlns:ds="http://schemas.openxmlformats.org/officeDocument/2006/customXml" ds:itemID="{81F788BB-310B-43D7-B9F5-95A6C7D991AA}">
+  <ds:schemaRefs>
+    <ds:schemaRef ds:uri="http://schemas.openxmlformats.org/officeDocument/2006/bibliography"/>
+  </ds:schemaRefs>
+</ds:datastoreItem>
+</file>
+
 <file path=docMetadata/LabelInfo.xml><?xml version="1.0" encoding="utf-8"?>
 <clbl:labelList xmlns:clbl="http://schemas.microsoft.com/office/2020/mipLabelMetadata"/>
 </file>
</xml_diff>